<commit_message>
docs: sync submission draft with v0.1.0 release
</commit_message>
<xml_diff>
--- a/docs/competition/submission/Reqover_result_report_draft.docx
+++ b/docs/competition/submission/Reqover_result_report_draft.docx
@@ -2244,19 +2244,7 @@
                 <w:sz w:val="20"/>
                 <w:lang w:val="ko-KR" w:eastAsia="ko-KR"/>
               </w:rPr>
-              <w:t xml:space="preserve">2026-08-10 로컬 JDK 17 및 Temurin 21.0.12 clean build에서 35 tests 통과. CycloneDX 1.6 SBOM 고정본 일치, Maven 구성요소 96개 OSV 조회 결과 0건. </w:t>
-            </w:r>
-            <w:r>
-              <w:rPr>
-                <w:rFonts w:ascii="Malgun Gothic" w:hAnsi="Malgun Gothic" w:eastAsia="Malgun Gothic" w:cs="Malgun Gothic"/>
-                <w:b/>
-                <w:i w:val="0"/>
-                <w:color w:val="C00000"/>
-                <w:sz w:val="20"/>
-                <w:highlight w:val="yellow"/>
-                <w:lang w:val="ko-KR" w:eastAsia="ko-KR"/>
-              </w:rPr>
-              <w:t>[확인 필요: 최종 제출 tag·commit SHA·GitHub Actions 성공 URL]</w:t>
+              <w:t>2026-08-10 JDK 17·21 clean build 35 tests 통과, CycloneDX 1.6 SBOM lock 일치, 외부 Maven 구성요소 96개 OSV 0건. v0.1.0=62910fc1896d. Release CI 성공: https://github.com/reqover-labs/reqover/actions/runs/31366748139</w:t>
             </w:r>
           </w:p>
         </w:tc>

</xml_diff>

<commit_message>
docs(report): fill in the v0.2.0 release verification and fit five pages
The verification line now carries the real tag commit (17b1eea9939c) and the
release CI run that produced it, so no [확인 필요: marker survives.

Word puts the regenerated body at six pages, one over the rule, so the prose
is tightened until it measures five again: 13 pages total, the same as the
0.1.1 submission. Editing this text without re-measuring is how it silently
goes over.

The video deck slides still claimed 35 tests and 0.1.0.
</commit_message>
<xml_diff>
--- a/docs/competition/submission/Reqover_result_report_draft.docx
+++ b/docs/competition/submission/Reqover_result_report_draft.docx
@@ -2268,32 +2268,32 @@
                 <w:sz w:val="20"/>
                 <w:lang w:val="ko-KR" w:eastAsia="ko-KR"/>
               </w:rPr>
-              <w:t xml:space="preserve">2026-08-21 v0.2.0 기준 JDK 21 clean build와 121개 자동화 테스트, 그리고 기록→내보내기→영향도 분석 CI 파이프라인 검증을 모두 통과했다. </w:t>
-            </w:r>
-            <w:r>
-              <w:rPr>
-                <w:rFonts w:ascii="Malgun Gothic" w:hAnsi="Malgun Gothic" w:eastAsia="Malgun Gothic" w:cs="Malgun Gothic"/>
-                <w:b/>
-                <w:i w:val="0"/>
-                <w:color w:val="C00000"/>
-                <w:sz w:val="20"/>
-                <w:highlight w:val="yellow"/>
-                <w:lang w:val="ko-KR" w:eastAsia="ko-KR"/>
-              </w:rPr>
-              <w:t>[확인 필요: v0.2.0 태그 커밋 해시와 릴리스 CI 실행 URL — 태그 푸시 후 채울 것]</w:t>
-            </w:r>
-            <w:r>
-              <w:rPr>
-                <w:rFonts w:ascii="Malgun Gothic" w:hAnsi="Malgun Gothic" w:eastAsia="Malgun Gothic" w:cs="Malgun Gothic"/>
-                <w:b w:val="0"/>
-                <w:i w:val="0"/>
-                <w:color w:val="000000"/>
-                <w:sz w:val="20"/>
-                <w:lang w:val="ko-KR" w:eastAsia="ko-KR"/>
-              </w:rPr>
-              <w:t xml:space="preserve"> 직전 기록은 v0.1.1(2ae31931984f), </w:t>
+              <w:t xml:space="preserve">2026-08-21 v0.2.0(태그 커밋 17b1eea9939c) 릴리스 CI에서 JDK 17과 21의 clean build와 121개 자동화 테스트, 기록→내보내기→영향도 분석 파이프라인 검증을 모두 통과했다. 실행 기록: </w:t>
             </w:r>
             <w:hyperlink r:id="rId15">
+              <w:r>
+                <w:rPr>
+                  <w:rFonts w:ascii="Malgun Gothic" w:hAnsi="Malgun Gothic" w:eastAsia="Malgun Gothic" w:cs="Malgun Gothic"/>
+                  <w:color w:val="0563C1"/>
+                  <w:sz w:val="20"/>
+                  <w:u w:val="single"/>
+                  <w:lang w:val="ko-KR" w:eastAsia="ko-KR"/>
+                </w:rPr>
+                <w:t>https://github.com/reqover-labs/reqover/actions/runs/32452321362</w:t>
+              </w:r>
+            </w:hyperlink>
+            <w:r>
+              <w:rPr>
+                <w:rFonts w:ascii="Malgun Gothic" w:hAnsi="Malgun Gothic" w:eastAsia="Malgun Gothic" w:cs="Malgun Gothic"/>
+                <w:b w:val="0"/>
+                <w:i w:val="0"/>
+                <w:color w:val="000000"/>
+                <w:sz w:val="20"/>
+                <w:lang w:val="ko-KR" w:eastAsia="ko-KR"/>
+              </w:rPr>
+              <w:t xml:space="preserve"> (직전 기록은 2026-08-15 v0.1.1=2ae31931984f, </w:t>
+            </w:r>
+            <w:hyperlink r:id="rId16">
               <w:r>
                 <w:rPr>
                   <w:rFonts w:ascii="Malgun Gothic" w:hAnsi="Malgun Gothic" w:eastAsia="Malgun Gothic" w:cs="Malgun Gothic"/>
@@ -2305,6 +2305,17 @@
                 <w:t>https://github.com/reqover-labs/reqover/actions/runs/31864712084</w:t>
               </w:r>
             </w:hyperlink>
+            <w:r>
+              <w:rPr>
+                <w:rFonts w:ascii="Malgun Gothic" w:hAnsi="Malgun Gothic" w:eastAsia="Malgun Gothic" w:cs="Malgun Gothic"/>
+                <w:b w:val="0"/>
+                <w:i w:val="0"/>
+                <w:color w:val="000000"/>
+                <w:sz w:val="20"/>
+                <w:lang w:val="ko-KR" w:eastAsia="ko-KR"/>
+              </w:rPr>
+              <w:t>)</w:t>
+            </w:r>
           </w:p>
           <w:p>
             <w:pPr>
@@ -3430,7 +3441,7 @@
                 <w:lang w:val="ko-KR" w:eastAsia="ko-KR"/>
               </w:rPr>
             </w:r>
-            <w:hyperlink r:id="rId16">
+            <w:hyperlink r:id="rId17">
               <w:r>
                 <w:rPr>
                   <w:rFonts w:ascii="Malgun Gothic" w:hAnsi="Malgun Gothic" w:eastAsia="Malgun Gothic" w:cs="Malgun Gothic"/>
@@ -3701,7 +3712,7 @@
                 <w:lang w:val="ko-KR" w:eastAsia="ko-KR"/>
               </w:rPr>
             </w:r>
-            <w:hyperlink r:id="rId17">
+            <w:hyperlink r:id="rId18">
               <w:r>
                 <w:rPr>
                   <w:rFonts w:ascii="Malgun Gothic" w:hAnsi="Malgun Gothic" w:eastAsia="Malgun Gothic" w:cs="Malgun Gothic"/>
@@ -3972,7 +3983,7 @@
                 <w:lang w:val="ko-KR" w:eastAsia="ko-KR"/>
               </w:rPr>
             </w:r>
-            <w:hyperlink r:id="rId18">
+            <w:hyperlink r:id="rId19">
               <w:r>
                 <w:rPr>
                   <w:rFonts w:ascii="Malgun Gothic" w:hAnsi="Malgun Gothic" w:eastAsia="Malgun Gothic" w:cs="Malgun Gothic"/>
@@ -4243,7 +4254,7 @@
                 <w:lang w:val="ko-KR" w:eastAsia="ko-KR"/>
               </w:rPr>
             </w:r>
-            <w:hyperlink r:id="rId19">
+            <w:hyperlink r:id="rId20">
               <w:r>
                 <w:rPr>
                   <w:rFonts w:ascii="Malgun Gothic" w:hAnsi="Malgun Gothic" w:eastAsia="Malgun Gothic" w:cs="Malgun Gothic"/>
@@ -4514,7 +4525,7 @@
                 <w:lang w:val="ko-KR" w:eastAsia="ko-KR"/>
               </w:rPr>
             </w:r>
-            <w:hyperlink r:id="rId20">
+            <w:hyperlink r:id="rId21">
               <w:r>
                 <w:rPr>
                   <w:rFonts w:ascii="Malgun Gothic" w:hAnsi="Malgun Gothic" w:eastAsia="Malgun Gothic" w:cs="Malgun Gothic"/>
@@ -4785,7 +4796,7 @@
                 <w:lang w:val="ko-KR" w:eastAsia="ko-KR"/>
               </w:rPr>
             </w:r>
-            <w:hyperlink r:id="rId21">
+            <w:hyperlink r:id="rId22">
               <w:r>
                 <w:rPr>
                   <w:rFonts w:ascii="Malgun Gothic" w:hAnsi="Malgun Gothic" w:eastAsia="Malgun Gothic" w:cs="Malgun Gothic"/>
@@ -5056,7 +5067,7 @@
                 <w:lang w:val="ko-KR" w:eastAsia="ko-KR"/>
               </w:rPr>
             </w:r>
-            <w:hyperlink r:id="rId22">
+            <w:hyperlink r:id="rId23">
               <w:r>
                 <w:rPr>
                   <w:rFonts w:ascii="Malgun Gothic" w:hAnsi="Malgun Gothic" w:eastAsia="Malgun Gothic" w:cs="Malgun Gothic"/>
@@ -5327,7 +5338,7 @@
                 <w:lang w:val="ko-KR" w:eastAsia="ko-KR"/>
               </w:rPr>
             </w:r>
-            <w:hyperlink r:id="rId23">
+            <w:hyperlink r:id="rId24">
               <w:r>
                 <w:rPr>
                   <w:rFonts w:ascii="Malgun Gothic" w:hAnsi="Malgun Gothic" w:eastAsia="Malgun Gothic" w:cs="Malgun Gothic"/>
@@ -5598,7 +5609,7 @@
                 <w:lang w:val="ko-KR" w:eastAsia="ko-KR"/>
               </w:rPr>
             </w:r>
-            <w:hyperlink r:id="rId24">
+            <w:hyperlink r:id="rId25">
               <w:r>
                 <w:rPr>
                   <w:rFonts w:ascii="Malgun Gothic" w:hAnsi="Malgun Gothic" w:eastAsia="Malgun Gothic" w:cs="Malgun Gothic"/>
@@ -5869,7 +5880,7 @@
                 <w:lang w:val="ko-KR" w:eastAsia="ko-KR"/>
               </w:rPr>
             </w:r>
-            <w:hyperlink r:id="rId25">
+            <w:hyperlink r:id="rId26">
               <w:r>
                 <w:rPr>
                   <w:rFonts w:ascii="Malgun Gothic" w:hAnsi="Malgun Gothic" w:eastAsia="Malgun Gothic" w:cs="Malgun Gothic"/>
@@ -6140,7 +6151,7 @@
                 <w:lang w:val="ko-KR" w:eastAsia="ko-KR"/>
               </w:rPr>
             </w:r>
-            <w:hyperlink r:id="rId26">
+            <w:hyperlink r:id="rId27">
               <w:r>
                 <w:rPr>
                   <w:rFonts w:ascii="Malgun Gothic" w:hAnsi="Malgun Gothic" w:eastAsia="Malgun Gothic" w:cs="Malgun Gothic"/>
@@ -6411,7 +6422,7 @@
                 <w:lang w:val="ko-KR" w:eastAsia="ko-KR"/>
               </w:rPr>
             </w:r>
-            <w:hyperlink r:id="rId27">
+            <w:hyperlink r:id="rId28">
               <w:r>
                 <w:rPr>
                   <w:rFonts w:ascii="Malgun Gothic" w:hAnsi="Malgun Gothic" w:eastAsia="Malgun Gothic" w:cs="Malgun Gothic"/>
@@ -6682,7 +6693,7 @@
                 <w:lang w:val="ko-KR" w:eastAsia="ko-KR"/>
               </w:rPr>
             </w:r>
-            <w:hyperlink r:id="rId28">
+            <w:hyperlink r:id="rId29">
               <w:r>
                 <w:rPr>
                   <w:rFonts w:ascii="Malgun Gothic" w:hAnsi="Malgun Gothic" w:eastAsia="Malgun Gothic" w:cs="Malgun Gothic"/>
@@ -6953,7 +6964,7 @@
                 <w:lang w:val="ko-KR" w:eastAsia="ko-KR"/>
               </w:rPr>
             </w:r>
-            <w:hyperlink r:id="rId29">
+            <w:hyperlink r:id="rId30">
               <w:r>
                 <w:rPr>
                   <w:rFonts w:ascii="Malgun Gothic" w:hAnsi="Malgun Gothic" w:eastAsia="Malgun Gothic" w:cs="Malgun Gothic"/>
@@ -7224,7 +7235,7 @@
                 <w:lang w:val="ko-KR" w:eastAsia="ko-KR"/>
               </w:rPr>
             </w:r>
-            <w:hyperlink r:id="rId30">
+            <w:hyperlink r:id="rId31">
               <w:r>
                 <w:rPr>
                   <w:rFonts w:ascii="Malgun Gothic" w:hAnsi="Malgun Gothic" w:eastAsia="Malgun Gothic" w:cs="Malgun Gothic"/>
@@ -7495,7 +7506,7 @@
                 <w:lang w:val="ko-KR" w:eastAsia="ko-KR"/>
               </w:rPr>
             </w:r>
-            <w:hyperlink r:id="rId31">
+            <w:hyperlink r:id="rId32">
               <w:r>
                 <w:rPr>
                   <w:rFonts w:ascii="Malgun Gothic" w:hAnsi="Malgun Gothic" w:eastAsia="Malgun Gothic" w:cs="Malgun Gothic"/>
@@ -7766,7 +7777,7 @@
                 <w:lang w:val="ko-KR" w:eastAsia="ko-KR"/>
               </w:rPr>
             </w:r>
-            <w:hyperlink r:id="rId32">
+            <w:hyperlink r:id="rId33">
               <w:r>
                 <w:rPr>
                   <w:rFonts w:ascii="Malgun Gothic" w:hAnsi="Malgun Gothic" w:eastAsia="Malgun Gothic" w:cs="Malgun Gothic"/>
@@ -8037,7 +8048,7 @@
                 <w:lang w:val="ko-KR" w:eastAsia="ko-KR"/>
               </w:rPr>
             </w:r>
-            <w:hyperlink r:id="rId33">
+            <w:hyperlink r:id="rId34">
               <w:r>
                 <w:rPr>
                   <w:rFonts w:ascii="Malgun Gothic" w:hAnsi="Malgun Gothic" w:eastAsia="Malgun Gothic" w:cs="Malgun Gothic"/>
@@ -8308,7 +8319,7 @@
                 <w:lang w:val="ko-KR" w:eastAsia="ko-KR"/>
               </w:rPr>
             </w:r>
-            <w:hyperlink r:id="rId34">
+            <w:hyperlink r:id="rId35">
               <w:r>
                 <w:rPr>
                   <w:rFonts w:ascii="Malgun Gothic" w:hAnsi="Malgun Gothic" w:eastAsia="Malgun Gothic" w:cs="Malgun Gothic"/>
@@ -8579,7 +8590,7 @@
                 <w:lang w:val="ko-KR" w:eastAsia="ko-KR"/>
               </w:rPr>
             </w:r>
-            <w:hyperlink r:id="rId35">
+            <w:hyperlink r:id="rId36">
               <w:r>
                 <w:rPr>
                   <w:rFonts w:ascii="Malgun Gothic" w:hAnsi="Malgun Gothic" w:eastAsia="Malgun Gothic" w:cs="Malgun Gothic"/>
@@ -8850,7 +8861,7 @@
                 <w:lang w:val="ko-KR" w:eastAsia="ko-KR"/>
               </w:rPr>
             </w:r>
-            <w:hyperlink r:id="rId36">
+            <w:hyperlink r:id="rId37">
               <w:r>
                 <w:rPr>
                   <w:rFonts w:ascii="Malgun Gothic" w:hAnsi="Malgun Gothic" w:eastAsia="Malgun Gothic" w:cs="Malgun Gothic"/>
@@ -9121,7 +9132,7 @@
                 <w:lang w:val="ko-KR" w:eastAsia="ko-KR"/>
               </w:rPr>
             </w:r>
-            <w:hyperlink r:id="rId37">
+            <w:hyperlink r:id="rId38">
               <w:r>
                 <w:rPr>
                   <w:rFonts w:ascii="Malgun Gothic" w:hAnsi="Malgun Gothic" w:eastAsia="Malgun Gothic" w:cs="Malgun Gothic"/>
@@ -9392,7 +9403,7 @@
                 <w:lang w:val="ko-KR" w:eastAsia="ko-KR"/>
               </w:rPr>
             </w:r>
-            <w:hyperlink r:id="rId38">
+            <w:hyperlink r:id="rId39">
               <w:r>
                 <w:rPr>
                   <w:rFonts w:ascii="Malgun Gothic" w:hAnsi="Malgun Gothic" w:eastAsia="Malgun Gothic" w:cs="Malgun Gothic"/>
@@ -9663,7 +9674,7 @@
                 <w:lang w:val="ko-KR" w:eastAsia="ko-KR"/>
               </w:rPr>
             </w:r>
-            <w:hyperlink r:id="rId39">
+            <w:hyperlink r:id="rId40">
               <w:r>
                 <w:rPr>
                   <w:rFonts w:ascii="Malgun Gothic" w:hAnsi="Malgun Gothic" w:eastAsia="Malgun Gothic" w:cs="Malgun Gothic"/>
@@ -9934,7 +9945,7 @@
                 <w:lang w:val="ko-KR" w:eastAsia="ko-KR"/>
               </w:rPr>
             </w:r>
-            <w:hyperlink r:id="rId40">
+            <w:hyperlink r:id="rId41">
               <w:r>
                 <w:rPr>
                   <w:rFonts w:ascii="Malgun Gothic" w:hAnsi="Malgun Gothic" w:eastAsia="Malgun Gothic" w:cs="Malgun Gothic"/>
@@ -10205,7 +10216,7 @@
                 <w:lang w:val="ko-KR" w:eastAsia="ko-KR"/>
               </w:rPr>
             </w:r>
-            <w:hyperlink r:id="rId41">
+            <w:hyperlink r:id="rId42">
               <w:r>
                 <w:rPr>
                   <w:rFonts w:ascii="Malgun Gothic" w:hAnsi="Malgun Gothic" w:eastAsia="Malgun Gothic" w:cs="Malgun Gothic"/>
@@ -10476,7 +10487,7 @@
                 <w:lang w:val="ko-KR" w:eastAsia="ko-KR"/>
               </w:rPr>
             </w:r>
-            <w:hyperlink r:id="rId42">
+            <w:hyperlink r:id="rId43">
               <w:r>
                 <w:rPr>
                   <w:rFonts w:ascii="Malgun Gothic" w:hAnsi="Malgun Gothic" w:eastAsia="Malgun Gothic" w:cs="Malgun Gothic"/>
@@ -10747,7 +10758,7 @@
                 <w:lang w:val="ko-KR" w:eastAsia="ko-KR"/>
               </w:rPr>
             </w:r>
-            <w:hyperlink r:id="rId43">
+            <w:hyperlink r:id="rId44">
               <w:r>
                 <w:rPr>
                   <w:rFonts w:ascii="Malgun Gothic" w:hAnsi="Malgun Gothic" w:eastAsia="Malgun Gothic" w:cs="Malgun Gothic"/>
@@ -11018,7 +11029,7 @@
                 <w:lang w:val="ko-KR" w:eastAsia="ko-KR"/>
               </w:rPr>
             </w:r>
-            <w:hyperlink r:id="rId44">
+            <w:hyperlink r:id="rId45">
               <w:r>
                 <w:rPr>
                   <w:rFonts w:ascii="Malgun Gothic" w:hAnsi="Malgun Gothic" w:eastAsia="Malgun Gothic" w:cs="Malgun Gothic"/>
@@ -11289,7 +11300,7 @@
                 <w:lang w:val="ko-KR" w:eastAsia="ko-KR"/>
               </w:rPr>
             </w:r>
-            <w:hyperlink r:id="rId45">
+            <w:hyperlink r:id="rId46">
               <w:r>
                 <w:rPr>
                   <w:rFonts w:ascii="Malgun Gothic" w:hAnsi="Malgun Gothic" w:eastAsia="Malgun Gothic" w:cs="Malgun Gothic"/>
@@ -11560,7 +11571,7 @@
                 <w:lang w:val="ko-KR" w:eastAsia="ko-KR"/>
               </w:rPr>
             </w:r>
-            <w:hyperlink r:id="rId46">
+            <w:hyperlink r:id="rId47">
               <w:r>
                 <w:rPr>
                   <w:rFonts w:ascii="Malgun Gothic" w:hAnsi="Malgun Gothic" w:eastAsia="Malgun Gothic" w:cs="Malgun Gothic"/>
@@ -11831,7 +11842,7 @@
                 <w:lang w:val="ko-KR" w:eastAsia="ko-KR"/>
               </w:rPr>
             </w:r>
-            <w:hyperlink r:id="rId47">
+            <w:hyperlink r:id="rId48">
               <w:r>
                 <w:rPr>
                   <w:rFonts w:ascii="Malgun Gothic" w:hAnsi="Malgun Gothic" w:eastAsia="Malgun Gothic" w:cs="Malgun Gothic"/>
@@ -12102,7 +12113,7 @@
                 <w:lang w:val="ko-KR" w:eastAsia="ko-KR"/>
               </w:rPr>
             </w:r>
-            <w:hyperlink r:id="rId48">
+            <w:hyperlink r:id="rId49">
               <w:r>
                 <w:rPr>
                   <w:rFonts w:ascii="Malgun Gothic" w:hAnsi="Malgun Gothic" w:eastAsia="Malgun Gothic" w:cs="Malgun Gothic"/>
@@ -12373,7 +12384,7 @@
                 <w:lang w:val="ko-KR" w:eastAsia="ko-KR"/>
               </w:rPr>
             </w:r>
-            <w:hyperlink r:id="rId49">
+            <w:hyperlink r:id="rId50">
               <w:r>
                 <w:rPr>
                   <w:rFonts w:ascii="Malgun Gothic" w:hAnsi="Malgun Gothic" w:eastAsia="Malgun Gothic" w:cs="Malgun Gothic"/>
@@ -12644,7 +12655,7 @@
                 <w:lang w:val="ko-KR" w:eastAsia="ko-KR"/>
               </w:rPr>
             </w:r>
-            <w:hyperlink r:id="rId50">
+            <w:hyperlink r:id="rId51">
               <w:r>
                 <w:rPr>
                   <w:rFonts w:ascii="Malgun Gothic" w:hAnsi="Malgun Gothic" w:eastAsia="Malgun Gothic" w:cs="Malgun Gothic"/>
@@ -12915,7 +12926,7 @@
                 <w:lang w:val="ko-KR" w:eastAsia="ko-KR"/>
               </w:rPr>
             </w:r>
-            <w:hyperlink r:id="rId50">
+            <w:hyperlink r:id="rId51">
               <w:r>
                 <w:rPr>
                   <w:rFonts w:ascii="Malgun Gothic" w:hAnsi="Malgun Gothic" w:eastAsia="Malgun Gothic" w:cs="Malgun Gothic"/>
@@ -13186,7 +13197,7 @@
                 <w:lang w:val="ko-KR" w:eastAsia="ko-KR"/>
               </w:rPr>
             </w:r>
-            <w:hyperlink r:id="rId51">
+            <w:hyperlink r:id="rId52">
               <w:r>
                 <w:rPr>
                   <w:rFonts w:ascii="Malgun Gothic" w:hAnsi="Malgun Gothic" w:eastAsia="Malgun Gothic" w:cs="Malgun Gothic"/>
@@ -13457,7 +13468,7 @@
                 <w:lang w:val="ko-KR" w:eastAsia="ko-KR"/>
               </w:rPr>
             </w:r>
-            <w:hyperlink r:id="rId51">
+            <w:hyperlink r:id="rId52">
               <w:r>
                 <w:rPr>
                   <w:rFonts w:ascii="Malgun Gothic" w:hAnsi="Malgun Gothic" w:eastAsia="Malgun Gothic" w:cs="Malgun Gothic"/>
@@ -13728,7 +13739,7 @@
                 <w:lang w:val="ko-KR" w:eastAsia="ko-KR"/>
               </w:rPr>
             </w:r>
-            <w:hyperlink r:id="rId52">
+            <w:hyperlink r:id="rId53">
               <w:r>
                 <w:rPr>
                   <w:rFonts w:ascii="Malgun Gothic" w:hAnsi="Malgun Gothic" w:eastAsia="Malgun Gothic" w:cs="Malgun Gothic"/>
@@ -13999,7 +14010,7 @@
                 <w:lang w:val="ko-KR" w:eastAsia="ko-KR"/>
               </w:rPr>
             </w:r>
-            <w:hyperlink r:id="rId53">
+            <w:hyperlink r:id="rId54">
               <w:r>
                 <w:rPr>
                   <w:rFonts w:ascii="Malgun Gothic" w:hAnsi="Malgun Gothic" w:eastAsia="Malgun Gothic" w:cs="Malgun Gothic"/>
@@ -14270,7 +14281,7 @@
                 <w:lang w:val="ko-KR" w:eastAsia="ko-KR"/>
               </w:rPr>
             </w:r>
-            <w:hyperlink r:id="rId54">
+            <w:hyperlink r:id="rId55">
               <w:r>
                 <w:rPr>
                   <w:rFonts w:ascii="Malgun Gothic" w:hAnsi="Malgun Gothic" w:eastAsia="Malgun Gothic" w:cs="Malgun Gothic"/>
@@ -14541,7 +14552,7 @@
                 <w:lang w:val="ko-KR" w:eastAsia="ko-KR"/>
               </w:rPr>
             </w:r>
-            <w:hyperlink r:id="rId55">
+            <w:hyperlink r:id="rId56">
               <w:r>
                 <w:rPr>
                   <w:rFonts w:ascii="Malgun Gothic" w:hAnsi="Malgun Gothic" w:eastAsia="Malgun Gothic" w:cs="Malgun Gothic"/>
@@ -14812,7 +14823,7 @@
                 <w:lang w:val="ko-KR" w:eastAsia="ko-KR"/>
               </w:rPr>
             </w:r>
-            <w:hyperlink r:id="rId56">
+            <w:hyperlink r:id="rId57">
               <w:r>
                 <w:rPr>
                   <w:rFonts w:ascii="Malgun Gothic" w:hAnsi="Malgun Gothic" w:eastAsia="Malgun Gothic" w:cs="Malgun Gothic"/>
@@ -15083,7 +15094,7 @@
                 <w:lang w:val="ko-KR" w:eastAsia="ko-KR"/>
               </w:rPr>
             </w:r>
-            <w:hyperlink r:id="rId57">
+            <w:hyperlink r:id="rId58">
               <w:r>
                 <w:rPr>
                   <w:rFonts w:ascii="Malgun Gothic" w:hAnsi="Malgun Gothic" w:eastAsia="Malgun Gothic" w:cs="Malgun Gothic"/>
@@ -15354,7 +15365,7 @@
                 <w:lang w:val="ko-KR" w:eastAsia="ko-KR"/>
               </w:rPr>
             </w:r>
-            <w:hyperlink r:id="rId58">
+            <w:hyperlink r:id="rId59">
               <w:r>
                 <w:rPr>
                   <w:rFonts w:ascii="Malgun Gothic" w:hAnsi="Malgun Gothic" w:eastAsia="Malgun Gothic" w:cs="Malgun Gothic"/>
@@ -15625,7 +15636,7 @@
                 <w:lang w:val="ko-KR" w:eastAsia="ko-KR"/>
               </w:rPr>
             </w:r>
-            <w:hyperlink r:id="rId58">
+            <w:hyperlink r:id="rId59">
               <w:r>
                 <w:rPr>
                   <w:rFonts w:ascii="Malgun Gothic" w:hAnsi="Malgun Gothic" w:eastAsia="Malgun Gothic" w:cs="Malgun Gothic"/>
@@ -15896,7 +15907,7 @@
                 <w:lang w:val="ko-KR" w:eastAsia="ko-KR"/>
               </w:rPr>
             </w:r>
-            <w:hyperlink r:id="rId59">
+            <w:hyperlink r:id="rId60">
               <w:r>
                 <w:rPr>
                   <w:rFonts w:ascii="Malgun Gothic" w:hAnsi="Malgun Gothic" w:eastAsia="Malgun Gothic" w:cs="Malgun Gothic"/>
@@ -16167,7 +16178,7 @@
                 <w:lang w:val="ko-KR" w:eastAsia="ko-KR"/>
               </w:rPr>
             </w:r>
-            <w:hyperlink r:id="rId60">
+            <w:hyperlink r:id="rId61">
               <w:r>
                 <w:rPr>
                   <w:rFonts w:ascii="Malgun Gothic" w:hAnsi="Malgun Gothic" w:eastAsia="Malgun Gothic" w:cs="Malgun Gothic"/>
@@ -16438,7 +16449,7 @@
                 <w:lang w:val="ko-KR" w:eastAsia="ko-KR"/>
               </w:rPr>
             </w:r>
-            <w:hyperlink r:id="rId61">
+            <w:hyperlink r:id="rId62">
               <w:r>
                 <w:rPr>
                   <w:rFonts w:ascii="Malgun Gothic" w:hAnsi="Malgun Gothic" w:eastAsia="Malgun Gothic" w:cs="Malgun Gothic"/>
@@ -16709,7 +16720,7 @@
                 <w:lang w:val="ko-KR" w:eastAsia="ko-KR"/>
               </w:rPr>
             </w:r>
-            <w:hyperlink r:id="rId62">
+            <w:hyperlink r:id="rId63">
               <w:r>
                 <w:rPr>
                   <w:rFonts w:ascii="Malgun Gothic" w:hAnsi="Malgun Gothic" w:eastAsia="Malgun Gothic" w:cs="Malgun Gothic"/>
@@ -16980,7 +16991,7 @@
                 <w:lang w:val="ko-KR" w:eastAsia="ko-KR"/>
               </w:rPr>
             </w:r>
-            <w:hyperlink r:id="rId63">
+            <w:hyperlink r:id="rId64">
               <w:r>
                 <w:rPr>
                   <w:rFonts w:ascii="Malgun Gothic" w:hAnsi="Malgun Gothic" w:eastAsia="Malgun Gothic" w:cs="Malgun Gothic"/>
@@ -17251,7 +17262,7 @@
                 <w:lang w:val="ko-KR" w:eastAsia="ko-KR"/>
               </w:rPr>
             </w:r>
-            <w:hyperlink r:id="rId64">
+            <w:hyperlink r:id="rId65">
               <w:r>
                 <w:rPr>
                   <w:rFonts w:ascii="Malgun Gothic" w:hAnsi="Malgun Gothic" w:eastAsia="Malgun Gothic" w:cs="Malgun Gothic"/>
@@ -17522,7 +17533,7 @@
                 <w:lang w:val="ko-KR" w:eastAsia="ko-KR"/>
               </w:rPr>
             </w:r>
-            <w:hyperlink r:id="rId65">
+            <w:hyperlink r:id="rId66">
               <w:r>
                 <w:rPr>
                   <w:rFonts w:ascii="Malgun Gothic" w:hAnsi="Malgun Gothic" w:eastAsia="Malgun Gothic" w:cs="Malgun Gothic"/>
@@ -17793,7 +17804,7 @@
                 <w:lang w:val="ko-KR" w:eastAsia="ko-KR"/>
               </w:rPr>
             </w:r>
-            <w:hyperlink r:id="rId66">
+            <w:hyperlink r:id="rId67">
               <w:r>
                 <w:rPr>
                   <w:rFonts w:ascii="Malgun Gothic" w:hAnsi="Malgun Gothic" w:eastAsia="Malgun Gothic" w:cs="Malgun Gothic"/>
@@ -18064,7 +18075,7 @@
                 <w:lang w:val="ko-KR" w:eastAsia="ko-KR"/>
               </w:rPr>
             </w:r>
-            <w:hyperlink r:id="rId67">
+            <w:hyperlink r:id="rId68">
               <w:r>
                 <w:rPr>
                   <w:rFonts w:ascii="Malgun Gothic" w:hAnsi="Malgun Gothic" w:eastAsia="Malgun Gothic" w:cs="Malgun Gothic"/>
@@ -18335,7 +18346,7 @@
                 <w:lang w:val="ko-KR" w:eastAsia="ko-KR"/>
               </w:rPr>
             </w:r>
-            <w:hyperlink r:id="rId68">
+            <w:hyperlink r:id="rId69">
               <w:r>
                 <w:rPr>
                   <w:rFonts w:ascii="Malgun Gothic" w:hAnsi="Malgun Gothic" w:eastAsia="Malgun Gothic" w:cs="Malgun Gothic"/>
@@ -18606,7 +18617,7 @@
                 <w:lang w:val="ko-KR" w:eastAsia="ko-KR"/>
               </w:rPr>
             </w:r>
-            <w:hyperlink r:id="rId69">
+            <w:hyperlink r:id="rId70">
               <w:r>
                 <w:rPr>
                   <w:rFonts w:ascii="Malgun Gothic" w:hAnsi="Malgun Gothic" w:eastAsia="Malgun Gothic" w:cs="Malgun Gothic"/>
@@ -18877,7 +18888,7 @@
                 <w:lang w:val="ko-KR" w:eastAsia="ko-KR"/>
               </w:rPr>
             </w:r>
-            <w:hyperlink r:id="rId70">
+            <w:hyperlink r:id="rId71">
               <w:r>
                 <w:rPr>
                   <w:rFonts w:ascii="Malgun Gothic" w:hAnsi="Malgun Gothic" w:eastAsia="Malgun Gothic" w:cs="Malgun Gothic"/>
@@ -19148,7 +19159,7 @@
                 <w:lang w:val="ko-KR" w:eastAsia="ko-KR"/>
               </w:rPr>
             </w:r>
-            <w:hyperlink r:id="rId70">
+            <w:hyperlink r:id="rId71">
               <w:r>
                 <w:rPr>
                   <w:rFonts w:ascii="Malgun Gothic" w:hAnsi="Malgun Gothic" w:eastAsia="Malgun Gothic" w:cs="Malgun Gothic"/>
@@ -19419,7 +19430,7 @@
                 <w:lang w:val="ko-KR" w:eastAsia="ko-KR"/>
               </w:rPr>
             </w:r>
-            <w:hyperlink r:id="rId70">
+            <w:hyperlink r:id="rId71">
               <w:r>
                 <w:rPr>
                   <w:rFonts w:ascii="Malgun Gothic" w:hAnsi="Malgun Gothic" w:eastAsia="Malgun Gothic" w:cs="Malgun Gothic"/>
@@ -19690,7 +19701,7 @@
                 <w:lang w:val="ko-KR" w:eastAsia="ko-KR"/>
               </w:rPr>
             </w:r>
-            <w:hyperlink r:id="rId70">
+            <w:hyperlink r:id="rId71">
               <w:r>
                 <w:rPr>
                   <w:rFonts w:ascii="Malgun Gothic" w:hAnsi="Malgun Gothic" w:eastAsia="Malgun Gothic" w:cs="Malgun Gothic"/>
@@ -19961,7 +19972,7 @@
                 <w:lang w:val="ko-KR" w:eastAsia="ko-KR"/>
               </w:rPr>
             </w:r>
-            <w:hyperlink r:id="rId70">
+            <w:hyperlink r:id="rId71">
               <w:r>
                 <w:rPr>
                   <w:rFonts w:ascii="Malgun Gothic" w:hAnsi="Malgun Gothic" w:eastAsia="Malgun Gothic" w:cs="Malgun Gothic"/>
@@ -20232,7 +20243,7 @@
                 <w:lang w:val="ko-KR" w:eastAsia="ko-KR"/>
               </w:rPr>
             </w:r>
-            <w:hyperlink r:id="rId70">
+            <w:hyperlink r:id="rId71">
               <w:r>
                 <w:rPr>
                   <w:rFonts w:ascii="Malgun Gothic" w:hAnsi="Malgun Gothic" w:eastAsia="Malgun Gothic" w:cs="Malgun Gothic"/>
@@ -20503,7 +20514,7 @@
                 <w:lang w:val="ko-KR" w:eastAsia="ko-KR"/>
               </w:rPr>
             </w:r>
-            <w:hyperlink r:id="rId70">
+            <w:hyperlink r:id="rId71">
               <w:r>
                 <w:rPr>
                   <w:rFonts w:ascii="Malgun Gothic" w:hAnsi="Malgun Gothic" w:eastAsia="Malgun Gothic" w:cs="Malgun Gothic"/>
@@ -20774,7 +20785,7 @@
                 <w:lang w:val="ko-KR" w:eastAsia="ko-KR"/>
               </w:rPr>
             </w:r>
-            <w:hyperlink r:id="rId70">
+            <w:hyperlink r:id="rId71">
               <w:r>
                 <w:rPr>
                   <w:rFonts w:ascii="Malgun Gothic" w:hAnsi="Malgun Gothic" w:eastAsia="Malgun Gothic" w:cs="Malgun Gothic"/>
@@ -21045,7 +21056,7 @@
                 <w:lang w:val="ko-KR" w:eastAsia="ko-KR"/>
               </w:rPr>
             </w:r>
-            <w:hyperlink r:id="rId71">
+            <w:hyperlink r:id="rId72">
               <w:r>
                 <w:rPr>
                   <w:rFonts w:ascii="Malgun Gothic" w:hAnsi="Malgun Gothic" w:eastAsia="Malgun Gothic" w:cs="Malgun Gothic"/>
@@ -21316,7 +21327,7 @@
                 <w:lang w:val="ko-KR" w:eastAsia="ko-KR"/>
               </w:rPr>
             </w:r>
-            <w:hyperlink r:id="rId71">
+            <w:hyperlink r:id="rId72">
               <w:r>
                 <w:rPr>
                   <w:rFonts w:ascii="Malgun Gothic" w:hAnsi="Malgun Gothic" w:eastAsia="Malgun Gothic" w:cs="Malgun Gothic"/>
@@ -21587,7 +21598,7 @@
                 <w:lang w:val="ko-KR" w:eastAsia="ko-KR"/>
               </w:rPr>
             </w:r>
-            <w:hyperlink r:id="rId72">
+            <w:hyperlink r:id="rId73">
               <w:r>
                 <w:rPr>
                   <w:rFonts w:ascii="Malgun Gothic" w:hAnsi="Malgun Gothic" w:eastAsia="Malgun Gothic" w:cs="Malgun Gothic"/>
@@ -21858,7 +21869,7 @@
                 <w:lang w:val="ko-KR" w:eastAsia="ko-KR"/>
               </w:rPr>
             </w:r>
-            <w:hyperlink r:id="rId73">
+            <w:hyperlink r:id="rId74">
               <w:r>
                 <w:rPr>
                   <w:rFonts w:ascii="Malgun Gothic" w:hAnsi="Malgun Gothic" w:eastAsia="Malgun Gothic" w:cs="Malgun Gothic"/>
@@ -22129,7 +22140,7 @@
                 <w:lang w:val="ko-KR" w:eastAsia="ko-KR"/>
               </w:rPr>
             </w:r>
-            <w:hyperlink r:id="rId74">
+            <w:hyperlink r:id="rId75">
               <w:r>
                 <w:rPr>
                   <w:rFonts w:ascii="Malgun Gothic" w:hAnsi="Malgun Gothic" w:eastAsia="Malgun Gothic" w:cs="Malgun Gothic"/>
@@ -22400,7 +22411,7 @@
                 <w:lang w:val="ko-KR" w:eastAsia="ko-KR"/>
               </w:rPr>
             </w:r>
-            <w:hyperlink r:id="rId74">
+            <w:hyperlink r:id="rId75">
               <w:r>
                 <w:rPr>
                   <w:rFonts w:ascii="Malgun Gothic" w:hAnsi="Malgun Gothic" w:eastAsia="Malgun Gothic" w:cs="Malgun Gothic"/>
@@ -22671,7 +22682,7 @@
                 <w:lang w:val="ko-KR" w:eastAsia="ko-KR"/>
               </w:rPr>
             </w:r>
-            <w:hyperlink r:id="rId74">
+            <w:hyperlink r:id="rId75">
               <w:r>
                 <w:rPr>
                   <w:rFonts w:ascii="Malgun Gothic" w:hAnsi="Malgun Gothic" w:eastAsia="Malgun Gothic" w:cs="Malgun Gothic"/>
@@ -22942,7 +22953,7 @@
                 <w:lang w:val="ko-KR" w:eastAsia="ko-KR"/>
               </w:rPr>
             </w:r>
-            <w:hyperlink r:id="rId74">
+            <w:hyperlink r:id="rId75">
               <w:r>
                 <w:rPr>
                   <w:rFonts w:ascii="Malgun Gothic" w:hAnsi="Malgun Gothic" w:eastAsia="Malgun Gothic" w:cs="Malgun Gothic"/>
@@ -23213,7 +23224,7 @@
                 <w:lang w:val="ko-KR" w:eastAsia="ko-KR"/>
               </w:rPr>
             </w:r>
-            <w:hyperlink r:id="rId75">
+            <w:hyperlink r:id="rId76">
               <w:r>
                 <w:rPr>
                   <w:rFonts w:ascii="Malgun Gothic" w:hAnsi="Malgun Gothic" w:eastAsia="Malgun Gothic" w:cs="Malgun Gothic"/>
@@ -23484,7 +23495,7 @@
                 <w:lang w:val="ko-KR" w:eastAsia="ko-KR"/>
               </w:rPr>
             </w:r>
-            <w:hyperlink r:id="rId75">
+            <w:hyperlink r:id="rId76">
               <w:r>
                 <w:rPr>
                   <w:rFonts w:ascii="Malgun Gothic" w:hAnsi="Malgun Gothic" w:eastAsia="Malgun Gothic" w:cs="Malgun Gothic"/>
@@ -23755,7 +23766,7 @@
                 <w:lang w:val="ko-KR" w:eastAsia="ko-KR"/>
               </w:rPr>
             </w:r>
-            <w:hyperlink r:id="rId76">
+            <w:hyperlink r:id="rId77">
               <w:r>
                 <w:rPr>
                   <w:rFonts w:ascii="Malgun Gothic" w:hAnsi="Malgun Gothic" w:eastAsia="Malgun Gothic" w:cs="Malgun Gothic"/>
@@ -24026,7 +24037,7 @@
                 <w:lang w:val="ko-KR" w:eastAsia="ko-KR"/>
               </w:rPr>
             </w:r>
-            <w:hyperlink r:id="rId77">
+            <w:hyperlink r:id="rId78">
               <w:r>
                 <w:rPr>
                   <w:rFonts w:ascii="Malgun Gothic" w:hAnsi="Malgun Gothic" w:eastAsia="Malgun Gothic" w:cs="Malgun Gothic"/>
@@ -24297,7 +24308,7 @@
                 <w:lang w:val="ko-KR" w:eastAsia="ko-KR"/>
               </w:rPr>
             </w:r>
-            <w:hyperlink r:id="rId78">
+            <w:hyperlink r:id="rId79">
               <w:r>
                 <w:rPr>
                   <w:rFonts w:ascii="Malgun Gothic" w:hAnsi="Malgun Gothic" w:eastAsia="Malgun Gothic" w:cs="Malgun Gothic"/>
@@ -24568,7 +24579,7 @@
                 <w:lang w:val="ko-KR" w:eastAsia="ko-KR"/>
               </w:rPr>
             </w:r>
-            <w:hyperlink r:id="rId79">
+            <w:hyperlink r:id="rId80">
               <w:r>
                 <w:rPr>
                   <w:rFonts w:ascii="Malgun Gothic" w:hAnsi="Malgun Gothic" w:eastAsia="Malgun Gothic" w:cs="Malgun Gothic"/>
@@ -24839,7 +24850,7 @@
                 <w:lang w:val="ko-KR" w:eastAsia="ko-KR"/>
               </w:rPr>
             </w:r>
-            <w:hyperlink r:id="rId80">
+            <w:hyperlink r:id="rId81">
               <w:r>
                 <w:rPr>
                   <w:rFonts w:ascii="Malgun Gothic" w:hAnsi="Malgun Gothic" w:eastAsia="Malgun Gothic" w:cs="Malgun Gothic"/>
@@ -25110,7 +25121,7 @@
                 <w:lang w:val="ko-KR" w:eastAsia="ko-KR"/>
               </w:rPr>
             </w:r>
-            <w:hyperlink r:id="rId80">
+            <w:hyperlink r:id="rId81">
               <w:r>
                 <w:rPr>
                   <w:rFonts w:ascii="Malgun Gothic" w:hAnsi="Malgun Gothic" w:eastAsia="Malgun Gothic" w:cs="Malgun Gothic"/>
@@ -25381,7 +25392,7 @@
                 <w:lang w:val="ko-KR" w:eastAsia="ko-KR"/>
               </w:rPr>
             </w:r>
-            <w:hyperlink r:id="rId80">
+            <w:hyperlink r:id="rId81">
               <w:r>
                 <w:rPr>
                   <w:rFonts w:ascii="Malgun Gothic" w:hAnsi="Malgun Gothic" w:eastAsia="Malgun Gothic" w:cs="Malgun Gothic"/>
@@ -25652,7 +25663,7 @@
                 <w:lang w:val="ko-KR" w:eastAsia="ko-KR"/>
               </w:rPr>
             </w:r>
-            <w:hyperlink r:id="rId80">
+            <w:hyperlink r:id="rId81">
               <w:r>
                 <w:rPr>
                   <w:rFonts w:ascii="Malgun Gothic" w:hAnsi="Malgun Gothic" w:eastAsia="Malgun Gothic" w:cs="Malgun Gothic"/>
@@ -25923,7 +25934,7 @@
                 <w:lang w:val="ko-KR" w:eastAsia="ko-KR"/>
               </w:rPr>
             </w:r>
-            <w:hyperlink r:id="rId80">
+            <w:hyperlink r:id="rId81">
               <w:r>
                 <w:rPr>
                   <w:rFonts w:ascii="Malgun Gothic" w:hAnsi="Malgun Gothic" w:eastAsia="Malgun Gothic" w:cs="Malgun Gothic"/>
@@ -26194,7 +26205,7 @@
                 <w:lang w:val="ko-KR" w:eastAsia="ko-KR"/>
               </w:rPr>
             </w:r>
-            <w:hyperlink r:id="rId80">
+            <w:hyperlink r:id="rId81">
               <w:r>
                 <w:rPr>
                   <w:rFonts w:ascii="Malgun Gothic" w:hAnsi="Malgun Gothic" w:eastAsia="Malgun Gothic" w:cs="Malgun Gothic"/>
@@ -26465,7 +26476,7 @@
                 <w:lang w:val="ko-KR" w:eastAsia="ko-KR"/>
               </w:rPr>
             </w:r>
-            <w:hyperlink r:id="rId80">
+            <w:hyperlink r:id="rId81">
               <w:r>
                 <w:rPr>
                   <w:rFonts w:ascii="Malgun Gothic" w:hAnsi="Malgun Gothic" w:eastAsia="Malgun Gothic" w:cs="Malgun Gothic"/>
@@ -26736,7 +26747,7 @@
                 <w:lang w:val="ko-KR" w:eastAsia="ko-KR"/>
               </w:rPr>
             </w:r>
-            <w:hyperlink r:id="rId80">
+            <w:hyperlink r:id="rId81">
               <w:r>
                 <w:rPr>
                   <w:rFonts w:ascii="Malgun Gothic" w:hAnsi="Malgun Gothic" w:eastAsia="Malgun Gothic" w:cs="Malgun Gothic"/>
@@ -27007,7 +27018,7 @@
                 <w:lang w:val="ko-KR" w:eastAsia="ko-KR"/>
               </w:rPr>
             </w:r>
-            <w:hyperlink r:id="rId80">
+            <w:hyperlink r:id="rId81">
               <w:r>
                 <w:rPr>
                   <w:rFonts w:ascii="Malgun Gothic" w:hAnsi="Malgun Gothic" w:eastAsia="Malgun Gothic" w:cs="Malgun Gothic"/>
@@ -27278,7 +27289,7 @@
                 <w:lang w:val="ko-KR" w:eastAsia="ko-KR"/>
               </w:rPr>
             </w:r>
-            <w:hyperlink r:id="rId80">
+            <w:hyperlink r:id="rId81">
               <w:r>
                 <w:rPr>
                   <w:rFonts w:ascii="Malgun Gothic" w:hAnsi="Malgun Gothic" w:eastAsia="Malgun Gothic" w:cs="Malgun Gothic"/>
@@ -27549,7 +27560,7 @@
                 <w:lang w:val="ko-KR" w:eastAsia="ko-KR"/>
               </w:rPr>
             </w:r>
-            <w:hyperlink r:id="rId81">
+            <w:hyperlink r:id="rId82">
               <w:r>
                 <w:rPr>
                   <w:rFonts w:ascii="Malgun Gothic" w:hAnsi="Malgun Gothic" w:eastAsia="Malgun Gothic" w:cs="Malgun Gothic"/>
@@ -27820,7 +27831,7 @@
                 <w:lang w:val="ko-KR" w:eastAsia="ko-KR"/>
               </w:rPr>
             </w:r>
-            <w:hyperlink r:id="rId81">
+            <w:hyperlink r:id="rId82">
               <w:r>
                 <w:rPr>
                   <w:rFonts w:ascii="Malgun Gothic" w:hAnsi="Malgun Gothic" w:eastAsia="Malgun Gothic" w:cs="Malgun Gothic"/>
@@ -28091,7 +28102,7 @@
                 <w:lang w:val="ko-KR" w:eastAsia="ko-KR"/>
               </w:rPr>
             </w:r>
-            <w:hyperlink r:id="rId81">
+            <w:hyperlink r:id="rId82">
               <w:r>
                 <w:rPr>
                   <w:rFonts w:ascii="Malgun Gothic" w:hAnsi="Malgun Gothic" w:eastAsia="Malgun Gothic" w:cs="Malgun Gothic"/>
@@ -28362,7 +28373,7 @@
                 <w:lang w:val="ko-KR" w:eastAsia="ko-KR"/>
               </w:rPr>
             </w:r>
-            <w:hyperlink r:id="rId81">
+            <w:hyperlink r:id="rId82">
               <w:r>
                 <w:rPr>
                   <w:rFonts w:ascii="Malgun Gothic" w:hAnsi="Malgun Gothic" w:eastAsia="Malgun Gothic" w:cs="Malgun Gothic"/>
@@ -28633,7 +28644,7 @@
                 <w:lang w:val="ko-KR" w:eastAsia="ko-KR"/>
               </w:rPr>
             </w:r>
-            <w:hyperlink r:id="rId81">
+            <w:hyperlink r:id="rId82">
               <w:r>
                 <w:rPr>
                   <w:rFonts w:ascii="Malgun Gothic" w:hAnsi="Malgun Gothic" w:eastAsia="Malgun Gothic" w:cs="Malgun Gothic"/>
@@ -28904,7 +28915,7 @@
                 <w:lang w:val="ko-KR" w:eastAsia="ko-KR"/>
               </w:rPr>
             </w:r>
-            <w:hyperlink r:id="rId81">
+            <w:hyperlink r:id="rId82">
               <w:r>
                 <w:rPr>
                   <w:rFonts w:ascii="Malgun Gothic" w:hAnsi="Malgun Gothic" w:eastAsia="Malgun Gothic" w:cs="Malgun Gothic"/>
@@ -29175,7 +29186,7 @@
                 <w:lang w:val="ko-KR" w:eastAsia="ko-KR"/>
               </w:rPr>
             </w:r>
-            <w:hyperlink r:id="rId81">
+            <w:hyperlink r:id="rId82">
               <w:r>
                 <w:rPr>
                   <w:rFonts w:ascii="Malgun Gothic" w:hAnsi="Malgun Gothic" w:eastAsia="Malgun Gothic" w:cs="Malgun Gothic"/>
@@ -29446,7 +29457,7 @@
                 <w:lang w:val="ko-KR" w:eastAsia="ko-KR"/>
               </w:rPr>
             </w:r>
-            <w:hyperlink r:id="rId81">
+            <w:hyperlink r:id="rId82">
               <w:r>
                 <w:rPr>
                   <w:rFonts w:ascii="Malgun Gothic" w:hAnsi="Malgun Gothic" w:eastAsia="Malgun Gothic" w:cs="Malgun Gothic"/>
@@ -29717,7 +29728,7 @@
                 <w:lang w:val="ko-KR" w:eastAsia="ko-KR"/>
               </w:rPr>
             </w:r>
-            <w:hyperlink r:id="rId81">
+            <w:hyperlink r:id="rId82">
               <w:r>
                 <w:rPr>
                   <w:rFonts w:ascii="Malgun Gothic" w:hAnsi="Malgun Gothic" w:eastAsia="Malgun Gothic" w:cs="Malgun Gothic"/>
@@ -29988,7 +29999,7 @@
                 <w:lang w:val="ko-KR" w:eastAsia="ko-KR"/>
               </w:rPr>
             </w:r>
-            <w:hyperlink r:id="rId81">
+            <w:hyperlink r:id="rId82">
               <w:r>
                 <w:rPr>
                   <w:rFonts w:ascii="Malgun Gothic" w:hAnsi="Malgun Gothic" w:eastAsia="Malgun Gothic" w:cs="Malgun Gothic"/>
@@ -30259,7 +30270,7 @@
                 <w:lang w:val="ko-KR" w:eastAsia="ko-KR"/>
               </w:rPr>
             </w:r>
-            <w:hyperlink r:id="rId81">
+            <w:hyperlink r:id="rId82">
               <w:r>
                 <w:rPr>
                   <w:rFonts w:ascii="Malgun Gothic" w:hAnsi="Malgun Gothic" w:eastAsia="Malgun Gothic" w:cs="Malgun Gothic"/>
@@ -30530,7 +30541,7 @@
                 <w:lang w:val="ko-KR" w:eastAsia="ko-KR"/>
               </w:rPr>
             </w:r>
-            <w:hyperlink r:id="rId81">
+            <w:hyperlink r:id="rId82">
               <w:r>
                 <w:rPr>
                   <w:rFonts w:ascii="Malgun Gothic" w:hAnsi="Malgun Gothic" w:eastAsia="Malgun Gothic" w:cs="Malgun Gothic"/>
@@ -30801,7 +30812,7 @@
                 <w:lang w:val="ko-KR" w:eastAsia="ko-KR"/>
               </w:rPr>
             </w:r>
-            <w:hyperlink r:id="rId81">
+            <w:hyperlink r:id="rId82">
               <w:r>
                 <w:rPr>
                   <w:rFonts w:ascii="Malgun Gothic" w:hAnsi="Malgun Gothic" w:eastAsia="Malgun Gothic" w:cs="Malgun Gothic"/>
@@ -31072,7 +31083,7 @@
                 <w:lang w:val="ko-KR" w:eastAsia="ko-KR"/>
               </w:rPr>
             </w:r>
-            <w:hyperlink r:id="rId82">
+            <w:hyperlink r:id="rId83">
               <w:r>
                 <w:rPr>
                   <w:rFonts w:ascii="Malgun Gothic" w:hAnsi="Malgun Gothic" w:eastAsia="Malgun Gothic" w:cs="Malgun Gothic"/>
@@ -31343,7 +31354,7 @@
                 <w:lang w:val="ko-KR" w:eastAsia="ko-KR"/>
               </w:rPr>
             </w:r>
-            <w:hyperlink r:id="rId83">
+            <w:hyperlink r:id="rId84">
               <w:r>
                 <w:rPr>
                   <w:rFonts w:ascii="Malgun Gothic" w:hAnsi="Malgun Gothic" w:eastAsia="Malgun Gothic" w:cs="Malgun Gothic"/>

</xml_diff>

<commit_message>
docs: point at the v6 demo film and cite the rules for the video
The README, its Korean counterpart, and the result report now carry
https://youtu.be/N62BEzVchSM. The demo caption lists what the new cut actually
shows, including the pull request comment.

06_submission_requirements claimed the rules require a public or unlisted
video. They do not: the form asks only for a YouTube URL, and neither the form
nor the operating rules constrain visibility or length. The real constraints
are Article 10(1), which requires the entry to be reviewable — so private is
out — and Article 12(2), which lets the organiser use the film for promotion.
Article 11(1) also settles the re-upload question: resubmission inside the
deadline is allowed and the last submission is the one judged, so a changed
video URL is not a problem.
</commit_message>
<xml_diff>
--- a/docs/competition/submission/Reqover_result_report_draft.docx
+++ b/docs/competition/submission/Reqover_result_report_draft.docx
@@ -1069,7 +1069,7 @@
                   <w:u w:val="single"/>
                   <w:lang w:val="ko-KR" w:eastAsia="ko-KR"/>
                 </w:rPr>
-                <w:t>https://youtu.be/9UtReW8TxZ8</w:t>
+                <w:t>https://youtu.be/N62BEzVchSM</w:t>
               </w:r>
             </w:hyperlink>
           </w:p>
@@ -1300,7 +1300,7 @@
                 <w:sz w:val="20"/>
                 <w:lang w:val="ko-KR" w:eastAsia="ko-KR"/>
               </w:rPr>
-              <w:t>누적 집계하는 코드 커버리지는 코드가 실행되었다는 사실만 보여줄 뿐, 어떤 HTTP 요청이 실행했는지는 알려 주지 않는다. 공유 로직이 많은 백엔드에서 재검증할 API를 고르는 일이 경험과 광범위한 회귀 테스트에 의존하는 이유다.</w:t>
+              <w:t>누적 집계하는 코드 커버리지는 코드가 실행되었다는 사실만 보여줄 뿐, 어떤 HTTP 요청이 실행했는지는 알려 주지 않는다. 공유 로직이 많은 백엔드에서 재검증할 API를 고르는 일이 경험에 의존하는 이유다.</w:t>
             </w:r>
           </w:p>
           <w:p>
@@ -1354,7 +1354,7 @@
                 <w:sz w:val="20"/>
                 <w:lang w:val="ko-KR" w:eastAsia="ko-KR"/>
               </w:rPr>
-              <w:t>제시하는 관계는 관측된 실행만 담은 하한(lower bound)이며, 정적 영향 분석을 대체하지 않는다.</w:t>
+              <w:t>제시하는 관계는 관측된 실행만 담은 하한이며, 정적 영향 분석을 대체하지 않는다.</w:t>
             </w:r>
           </w:p>
         </w:tc>
@@ -2482,7 +2482,7 @@
                 <w:sz w:val="20"/>
                 <w:lang w:val="ko-KR" w:eastAsia="ko-KR"/>
               </w:rPr>
-              <w:t>API 요청과 실행 코드를 연결해 공유 로직과 reactive 경로를 빠르게 이해한다.</w:t>
+              <w:t>API 요청과 실행 코드를 연결해 reactive 경로까지 빠르게 이해한다.</w:t>
             </w:r>
           </w:p>
           <w:p>
@@ -2536,7 +2536,7 @@
                 <w:sz w:val="20"/>
                 <w:lang w:val="ko-KR" w:eastAsia="ko-KR"/>
               </w:rPr>
-              <w:t>Spring은 국내 백엔드에서 가장 널리 쓰이고, 공유 로직이 많을수록 회귀 범위 결정 비용이 크다. Reqover는 그 근거를 계측 코드 없이 제공한다.</w:t>
+              <w:t>Spring은 국내 백엔드에서 가장 널리 쓰이고, 공유 로직이 많을수록 회귀 범위 결정 비용이 크다.</w:t>
             </w:r>
           </w:p>
           <w:p>
@@ -2563,7 +2563,7 @@
                 <w:sz w:val="20"/>
                 <w:lang w:val="ko-KR" w:eastAsia="ko-KR"/>
               </w:rPr>
-              <w:t>Apache-2.0, 재현 가능한 샘플, 기여·보안 가이드와 SBOM으로 외부 검증 기반을 마련한다.</w:t>
+              <w:t>Apache-2.0, 재현 가능한 샘플, 기여·보안 가이드와 SBOM을 제공한다.</w:t>
             </w:r>
           </w:p>
         </w:tc>
@@ -2709,7 +2709,7 @@
                 <w:sz w:val="20"/>
                 <w:lang w:val="ko-KR" w:eastAsia="ko-KR"/>
               </w:rPr>
-              <w:t>Maven Central 첫 배포, Gradle/Maven 플러그인, 영속 저장소, source-line·branch 정밀도, JaCoCo XML 상호운용, trace id 연계를 순차 추진한다.</w:t>
+              <w:t>Maven Central 첫 배포, Gradle/Maven 플러그인, 영속 저장소, source-line·branch 정밀도, JaCoCo XML 상호운용을 순차 추진한다.</w:t>
             </w:r>
           </w:p>
           <w:p>
@@ -2790,7 +2790,7 @@
                 <w:sz w:val="20"/>
                 <w:lang w:val="ko-KR" w:eastAsia="ko-KR"/>
               </w:rPr>
-              <w:t>요청 수명주기와 reactive context를 계측 결과에 연결하며, 잘못 귀속시키느니 귀속하지 않는 원칙이 중요함을 확인했다. 라이선스·SBOM·재현 문서도 완성도의 일부였다.</w:t>
+              <w:t>잘못 귀속시키느니 귀속하지 않는 원칙이 중요함을 확인했고, 라이선스·SBOM·재현 문서도 완성도의 일부였다.</w:t>
             </w:r>
           </w:p>
           <w:p>

</xml_diff>